<commit_message>
Remove superseded code: legacy universe paths, dead helpers and styles
- Old bulk "Define audit universe" API (candidates, coverage, define)
- Legacy universe import (location/unit codes with likelihood x impact)
- Legacy location and entity-unit create/edit endpoints and their schemas;
  entities are now defined only through Audit universe > Entities
- Broken form openers and unused functions (admin policies dialog, role
  select, unused constants), unused upload helpers and validators
- Inherent heat map on Analytics replaced by entities by assessed risk
- Unused CSS rules and an unused manual image
- Tests moved to the supported entity flow; manuals and screen docs updated

Co-Authored-By: Claude Opus 5.5 <noreply@anthropic.com>
Claude-Session: https://claude.ai/code/session_01BCzcS7kB9PYn4XhtsXF9GJ
</commit_message>
<xml_diff>
--- a/docs/manuals/05-User-Manual.docx
+++ b/docs/manuals/05-User-Manual.docx
@@ -167,7 +167,7 @@
         <w:p>
           <w:r>
             <w:fldChar w:fldCharType="begin" w:dirty="true"/>
-            <w:instrText xml:space="preserve">TOC \o "1-2" \h \z \u</w:instrText>
+            <w:instrText xml:space="preserve">TOC \o "1-3" \h \z \u</w:instrText>
             <w:fldChar w:fldCharType="separate"/>
             <w:fldChar w:fldCharType="end"/>
           </w:r>
@@ -205,40 +205,27 @@
       <w:tr>
         <w:trPr>
           <w:tblHeader w:val="true"/>
-          <w:tblHeader w:val="true"/>
         </w:trPr>
         <w:tc>
-          <w:tcPr>
-            <w:shd w:val="clear" w:color="auto" w:fill="1E60AE"/>
-          </w:tcPr>
-          <w:p>
-            <w:pPr>
-              <w:pStyle w:val="Compact"/>
-              <w:jc w:val="left"/>
-            </w:pPr>
-            <w:r>
-              <w:rPr>
-                <w:b/>
-                <w:color w:val="FFFFFF"/>
-              </w:rPr>
+          <w:tcPr/>
+          <w:p>
+            <w:pPr>
+              <w:pStyle w:val="Compact"/>
+              <w:jc w:val="left"/>
+            </w:pPr>
+            <w:r>
               <w:t xml:space="preserve">If you are…</w:t>
             </w:r>
           </w:p>
         </w:tc>
         <w:tc>
-          <w:tcPr>
-            <w:shd w:val="clear" w:color="auto" w:fill="1E60AE"/>
-          </w:tcPr>
-          <w:p>
-            <w:pPr>
-              <w:pStyle w:val="Compact"/>
-              <w:jc w:val="left"/>
-            </w:pPr>
-            <w:r>
-              <w:rPr>
-                <w:b/>
-                <w:color w:val="FFFFFF"/>
-              </w:rPr>
+          <w:tcPr/>
+          <w:p>
+            <w:pPr>
+              <w:pStyle w:val="Compact"/>
+              <w:jc w:val="left"/>
+            </w:pPr>
+            <w:r>
               <w:t xml:space="preserve">Read</w:t>
             </w:r>
           </w:p>
@@ -399,40 +386,27 @@
       <w:tr>
         <w:trPr>
           <w:tblHeader w:val="true"/>
-          <w:tblHeader w:val="true"/>
         </w:trPr>
         <w:tc>
-          <w:tcPr>
-            <w:shd w:val="clear" w:color="auto" w:fill="1E60AE"/>
-          </w:tcPr>
-          <w:p>
-            <w:pPr>
-              <w:pStyle w:val="Compact"/>
-              <w:jc w:val="left"/>
-            </w:pPr>
-            <w:r>
-              <w:rPr>
-                <w:b/>
-                <w:color w:val="FFFFFF"/>
-              </w:rPr>
+          <w:tcPr/>
+          <w:p>
+            <w:pPr>
+              <w:pStyle w:val="Compact"/>
+              <w:jc w:val="left"/>
+            </w:pPr>
+            <w:r>
               <w:t xml:space="preserve">Job role</w:t>
             </w:r>
           </w:p>
         </w:tc>
         <w:tc>
-          <w:tcPr>
-            <w:shd w:val="clear" w:color="auto" w:fill="1E60AE"/>
-          </w:tcPr>
-          <w:p>
-            <w:pPr>
-              <w:pStyle w:val="Compact"/>
-              <w:jc w:val="left"/>
-            </w:pPr>
-            <w:r>
-              <w:rPr>
-                <w:b/>
-                <w:color w:val="FFFFFF"/>
-              </w:rPr>
+          <w:tcPr/>
+          <w:p>
+            <w:pPr>
+              <w:pStyle w:val="Compact"/>
+              <w:jc w:val="left"/>
+            </w:pPr>
+            <w:r>
               <w:t xml:space="preserve">You use GIAW to…</w:t>
             </w:r>
           </w:p>
@@ -822,40 +796,27 @@
       <w:tr>
         <w:trPr>
           <w:tblHeader w:val="true"/>
-          <w:tblHeader w:val="true"/>
         </w:trPr>
         <w:tc>
-          <w:tcPr>
-            <w:shd w:val="clear" w:color="auto" w:fill="1E60AE"/>
-          </w:tcPr>
-          <w:p>
-            <w:pPr>
-              <w:pStyle w:val="Compact"/>
-              <w:jc w:val="left"/>
-            </w:pPr>
-            <w:r>
-              <w:rPr>
-                <w:b/>
-                <w:color w:val="FFFFFF"/>
-              </w:rPr>
+          <w:tcPr/>
+          <w:p>
+            <w:pPr>
+              <w:pStyle w:val="Compact"/>
+              <w:jc w:val="left"/>
+            </w:pPr>
+            <w:r>
               <w:t xml:space="preserve">Area</w:t>
             </w:r>
           </w:p>
         </w:tc>
         <w:tc>
-          <w:tcPr>
-            <w:shd w:val="clear" w:color="auto" w:fill="1E60AE"/>
-          </w:tcPr>
-          <w:p>
-            <w:pPr>
-              <w:pStyle w:val="Compact"/>
-              <w:jc w:val="left"/>
-            </w:pPr>
-            <w:r>
-              <w:rPr>
-                <w:b/>
-                <w:color w:val="FFFFFF"/>
-              </w:rPr>
+          <w:tcPr/>
+          <w:p>
+            <w:pPr>
+              <w:pStyle w:val="Compact"/>
+              <w:jc w:val="left"/>
+            </w:pPr>
+            <w:r>
               <w:t xml:space="preserve">What it does</w:t>
             </w:r>
           </w:p>
@@ -1994,52 +1955,171 @@
         <w:t xml:space="preserve">auditable entities</w:t>
       </w:r>
       <w:r>
-        <w:t xml:space="preserve">: units, processes and systems defined on the Org Structure and the Process library. Each entity shows its risk rating, audit frequency, when it was last audited, when the next audit is due and any planned audits. Use</w:t>
-      </w:r>
-      <w:r>
-        <w:t xml:space="preserve"> </w:t>
-      </w:r>
-      <w:r>
-        <w:rPr>
-          <w:bCs/>
-          <w:b/>
-        </w:rPr>
-        <w:t xml:space="preserve">Let’s start</w:t>
-      </w:r>
-      <w:r>
-        <w:t xml:space="preserve">,</w:t>
-      </w:r>
-      <w:r>
-        <w:t xml:space="preserve"> </w:t>
-      </w:r>
-      <w:r>
-        <w:rPr>
-          <w:bCs/>
-          <w:b/>
-        </w:rPr>
-        <w:t xml:space="preserve">Define</w:t>
-      </w:r>
-      <w:r>
-        <w:t xml:space="preserve"> </w:t>
-      </w:r>
-      <w:r>
-        <w:t xml:space="preserve">or</w:t>
-      </w:r>
-      <w:r>
-        <w:t xml:space="preserve"> </w:t>
-      </w:r>
-      <w:r>
-        <w:rPr>
-          <w:bCs/>
-          <w:b/>
-        </w:rPr>
-        <w:t xml:space="preserve">Redefine</w:t>
-      </w:r>
-      <w:r>
-        <w:t xml:space="preserve"> </w:t>
-      </w:r>
-      <w:r>
-        <w:t xml:space="preserve">to build or update the universe. Open an entity to see its details, its risk assessments, its audits, and its findings and actions.</w:t>
+        <w:t xml:space="preserve"> </w:t>
+      </w:r>
+      <w:r>
+        <w:t xml:space="preserve">built from the Org Structure and the Process library. It has four tabs:</w:t>
+      </w:r>
+    </w:p>
+    <w:p>
+      <w:pPr>
+        <w:numPr>
+          <w:ilvl w:val="0"/>
+          <w:numId w:val="1004"/>
+        </w:numPr>
+        <w:pStyle w:val="Compact"/>
+      </w:pPr>
+      <w:r>
+        <w:rPr>
+          <w:bCs/>
+          <w:b/>
+        </w:rPr>
+        <w:t xml:space="preserve">Overview</w:t>
+      </w:r>
+      <w:r>
+        <w:t xml:space="preserve">: the setup flow, the counts and the coverage.</w:t>
+      </w:r>
+    </w:p>
+    <w:p>
+      <w:pPr>
+        <w:numPr>
+          <w:ilvl w:val="0"/>
+          <w:numId w:val="1004"/>
+        </w:numPr>
+        <w:pStyle w:val="Compact"/>
+      </w:pPr>
+      <w:r>
+        <w:rPr>
+          <w:bCs/>
+          <w:b/>
+        </w:rPr>
+        <w:t xml:space="preserve">Units</w:t>
+      </w:r>
+      <w:r>
+        <w:t xml:space="preserve">: include the units that belong in the universe, or mark them</w:t>
+      </w:r>
+      <w:r>
+        <w:t xml:space="preserve"> </w:t>
+      </w:r>
+      <w:r>
+        <w:rPr>
+          <w:bCs/>
+          <w:b/>
+        </w:rPr>
+        <w:t xml:space="preserve">Not included</w:t>
+      </w:r>
+      <w:r>
+        <w:t xml:space="preserve"> </w:t>
+      </w:r>
+      <w:r>
+        <w:t xml:space="preserve">with a reason.</w:t>
+      </w:r>
+    </w:p>
+    <w:p>
+      <w:pPr>
+        <w:numPr>
+          <w:ilvl w:val="0"/>
+          <w:numId w:val="1004"/>
+        </w:numPr>
+        <w:pStyle w:val="Compact"/>
+      </w:pPr>
+      <w:r>
+        <w:rPr>
+          <w:bCs/>
+          <w:b/>
+        </w:rPr>
+        <w:t xml:space="preserve">Processes</w:t>
+      </w:r>
+      <w:r>
+        <w:t xml:space="preserve">: map each process to the units that perform it.</w:t>
+      </w:r>
+    </w:p>
+    <w:p>
+      <w:pPr>
+        <w:numPr>
+          <w:ilvl w:val="0"/>
+          <w:numId w:val="1004"/>
+        </w:numPr>
+        <w:pStyle w:val="Compact"/>
+      </w:pPr>
+      <w:r>
+        <w:rPr>
+          <w:bCs/>
+          <w:b/>
+        </w:rPr>
+        <w:t xml:space="preserve">Entities</w:t>
+      </w:r>
+      <w:r>
+        <w:t xml:space="preserve">: the register. Select</w:t>
+      </w:r>
+      <w:r>
+        <w:t xml:space="preserve"> </w:t>
+      </w:r>
+      <w:r>
+        <w:rPr>
+          <w:bCs/>
+          <w:b/>
+        </w:rPr>
+        <w:t xml:space="preserve">New entity</w:t>
+      </w:r>
+      <w:r>
+        <w:t xml:space="preserve">, choose the units and processes, the business owner and the scope, and save. Set the status to</w:t>
+      </w:r>
+      <w:r>
+        <w:t xml:space="preserve"> </w:t>
+      </w:r>
+      <w:r>
+        <w:rPr>
+          <w:bCs/>
+          <w:b/>
+        </w:rPr>
+        <w:t xml:space="preserve">Ready</w:t>
+      </w:r>
+      <w:r>
+        <w:t xml:space="preserve"> </w:t>
+      </w:r>
+      <w:r>
+        <w:t xml:space="preserve">when the entity is fully defined.</w:t>
+      </w:r>
+    </w:p>
+    <w:p>
+      <w:pPr>
+        <w:pStyle w:val="FirstParagraph"/>
+      </w:pPr>
+      <w:r>
+        <w:t xml:space="preserve">Open an entity to see its definition, its risk assessment, its audits, its findings and its history. Only</w:t>
+      </w:r>
+      <w:r>
+        <w:t xml:space="preserve"> </w:t>
+      </w:r>
+      <w:r>
+        <w:rPr>
+          <w:bCs/>
+          <w:b/>
+        </w:rPr>
+        <w:t xml:space="preserve">Ready</w:t>
+      </w:r>
+      <w:r>
+        <w:t xml:space="preserve"> </w:t>
+      </w:r>
+      <w:r>
+        <w:t xml:space="preserve">entities go to the audit risk assessment; use</w:t>
+      </w:r>
+      <w:r>
+        <w:t xml:space="preserve"> </w:t>
+      </w:r>
+      <w:r>
+        <w:rPr>
+          <w:bCs/>
+          <w:b/>
+        </w:rPr>
+        <w:t xml:space="preserve">Start audit risk assessment</w:t>
+      </w:r>
+      <w:r>
+        <w:t xml:space="preserve"> </w:t>
+      </w:r>
+      <w:r>
+        <w:t xml:space="preserve">on the entity page.</w:t>
       </w:r>
     </w:p>
     <w:bookmarkEnd w:id="54"/>
@@ -2111,7 +2191,7 @@
       <w:pPr>
         <w:numPr>
           <w:ilvl w:val="0"/>
-          <w:numId w:val="1004"/>
+          <w:numId w:val="1005"/>
         </w:numPr>
         <w:pStyle w:val="Compact"/>
       </w:pPr>
@@ -2136,7 +2216,7 @@
       <w:pPr>
         <w:numPr>
           <w:ilvl w:val="0"/>
-          <w:numId w:val="1004"/>
+          <w:numId w:val="1005"/>
         </w:numPr>
         <w:pStyle w:val="Compact"/>
       </w:pPr>
@@ -2161,7 +2241,7 @@
       <w:pPr>
         <w:numPr>
           <w:ilvl w:val="0"/>
-          <w:numId w:val="1004"/>
+          <w:numId w:val="1005"/>
         </w:numPr>
         <w:pStyle w:val="Compact"/>
       </w:pPr>
@@ -2186,7 +2266,7 @@
       <w:pPr>
         <w:numPr>
           <w:ilvl w:val="0"/>
-          <w:numId w:val="1004"/>
+          <w:numId w:val="1005"/>
         </w:numPr>
         <w:pStyle w:val="Compact"/>
       </w:pPr>
@@ -2365,7 +2445,7 @@
       <w:pPr>
         <w:numPr>
           <w:ilvl w:val="0"/>
-          <w:numId w:val="1005"/>
+          <w:numId w:val="1006"/>
         </w:numPr>
         <w:pStyle w:val="Compact"/>
       </w:pPr>
@@ -2419,7 +2499,7 @@
       <w:pPr>
         <w:numPr>
           <w:ilvl w:val="0"/>
-          <w:numId w:val="1005"/>
+          <w:numId w:val="1006"/>
         </w:numPr>
         <w:pStyle w:val="Compact"/>
       </w:pPr>
@@ -2454,7 +2534,7 @@
       <w:pPr>
         <w:numPr>
           <w:ilvl w:val="0"/>
-          <w:numId w:val="1005"/>
+          <w:numId w:val="1006"/>
         </w:numPr>
         <w:pStyle w:val="Compact"/>
       </w:pPr>
@@ -2476,7 +2556,7 @@
       <w:pPr>
         <w:numPr>
           <w:ilvl w:val="0"/>
-          <w:numId w:val="1005"/>
+          <w:numId w:val="1006"/>
         </w:numPr>
         <w:pStyle w:val="Compact"/>
       </w:pPr>
@@ -2514,7 +2594,7 @@
       <w:pPr>
         <w:numPr>
           <w:ilvl w:val="0"/>
-          <w:numId w:val="1005"/>
+          <w:numId w:val="1006"/>
         </w:numPr>
         <w:pStyle w:val="Compact"/>
       </w:pPr>
@@ -2542,7 +2622,7 @@
       <w:pPr>
         <w:numPr>
           <w:ilvl w:val="0"/>
-          <w:numId w:val="1005"/>
+          <w:numId w:val="1006"/>
         </w:numPr>
         <w:pStyle w:val="Compact"/>
       </w:pPr>
@@ -2564,7 +2644,7 @@
       <w:pPr>
         <w:numPr>
           <w:ilvl w:val="0"/>
-          <w:numId w:val="1005"/>
+          <w:numId w:val="1006"/>
         </w:numPr>
         <w:pStyle w:val="Compact"/>
       </w:pPr>
@@ -2818,40 +2898,27 @@
       <w:tr>
         <w:trPr>
           <w:tblHeader w:val="true"/>
-          <w:tblHeader w:val="true"/>
         </w:trPr>
         <w:tc>
-          <w:tcPr>
-            <w:shd w:val="clear" w:color="auto" w:fill="1E60AE"/>
-          </w:tcPr>
-          <w:p>
-            <w:pPr>
-              <w:pStyle w:val="Compact"/>
-              <w:jc w:val="left"/>
-            </w:pPr>
-            <w:r>
-              <w:rPr>
-                <w:b/>
-                <w:color w:val="FFFFFF"/>
-              </w:rPr>
+          <w:tcPr/>
+          <w:p>
+            <w:pPr>
+              <w:pStyle w:val="Compact"/>
+              <w:jc w:val="left"/>
+            </w:pPr>
+            <w:r>
               <w:t xml:space="preserve">Part of the page</w:t>
             </w:r>
           </w:p>
         </w:tc>
         <w:tc>
-          <w:tcPr>
-            <w:shd w:val="clear" w:color="auto" w:fill="1E60AE"/>
-          </w:tcPr>
-          <w:p>
-            <w:pPr>
-              <w:pStyle w:val="Compact"/>
-              <w:jc w:val="left"/>
-            </w:pPr>
-            <w:r>
-              <w:rPr>
-                <w:b/>
-                <w:color w:val="FFFFFF"/>
-              </w:rPr>
+          <w:tcPr/>
+          <w:p>
+            <w:pPr>
+              <w:pStyle w:val="Compact"/>
+              <w:jc w:val="left"/>
+            </w:pPr>
+            <w:r>
               <w:t xml:space="preserve">Use</w:t>
             </w:r>
           </w:p>
@@ -3361,40 +3428,27 @@
       <w:tr>
         <w:trPr>
           <w:tblHeader w:val="true"/>
-          <w:tblHeader w:val="true"/>
         </w:trPr>
         <w:tc>
-          <w:tcPr>
-            <w:shd w:val="clear" w:color="auto" w:fill="1E60AE"/>
-          </w:tcPr>
-          <w:p>
-            <w:pPr>
-              <w:pStyle w:val="Compact"/>
-              <w:jc w:val="left"/>
-            </w:pPr>
-            <w:r>
-              <w:rPr>
-                <w:b/>
-                <w:color w:val="FFFFFF"/>
-              </w:rPr>
+          <w:tcPr/>
+          <w:p>
+            <w:pPr>
+              <w:pStyle w:val="Compact"/>
+              <w:jc w:val="left"/>
+            </w:pPr>
+            <w:r>
               <w:t xml:space="preserve">Sub-tab</w:t>
             </w:r>
           </w:p>
         </w:tc>
         <w:tc>
-          <w:tcPr>
-            <w:shd w:val="clear" w:color="auto" w:fill="1E60AE"/>
-          </w:tcPr>
-          <w:p>
-            <w:pPr>
-              <w:pStyle w:val="Compact"/>
-              <w:jc w:val="left"/>
-            </w:pPr>
-            <w:r>
-              <w:rPr>
-                <w:b/>
-                <w:color w:val="FFFFFF"/>
-              </w:rPr>
+          <w:tcPr/>
+          <w:p>
+            <w:pPr>
+              <w:pStyle w:val="Compact"/>
+              <w:jc w:val="left"/>
+            </w:pPr>
+            <w:r>
               <w:t xml:space="preserve">What you do</w:t>
             </w:r>
           </w:p>
@@ -3977,7 +4031,7 @@
       <w:pPr>
         <w:numPr>
           <w:ilvl w:val="0"/>
-          <w:numId w:val="1006"/>
+          <w:numId w:val="1007"/>
         </w:numPr>
         <w:pStyle w:val="Compact"/>
       </w:pPr>
@@ -4034,7 +4088,7 @@
       <w:pPr>
         <w:numPr>
           <w:ilvl w:val="0"/>
-          <w:numId w:val="1006"/>
+          <w:numId w:val="1007"/>
         </w:numPr>
         <w:pStyle w:val="Compact"/>
       </w:pPr>
@@ -4078,7 +4132,7 @@
       <w:pPr>
         <w:numPr>
           <w:ilvl w:val="0"/>
-          <w:numId w:val="1006"/>
+          <w:numId w:val="1007"/>
         </w:numPr>
         <w:pStyle w:val="Compact"/>
       </w:pPr>
@@ -4122,7 +4176,7 @@
       <w:pPr>
         <w:numPr>
           <w:ilvl w:val="0"/>
-          <w:numId w:val="1006"/>
+          <w:numId w:val="1007"/>
         </w:numPr>
         <w:pStyle w:val="Compact"/>
       </w:pPr>
@@ -4320,7 +4374,7 @@
       <w:pPr>
         <w:numPr>
           <w:ilvl w:val="0"/>
-          <w:numId w:val="1007"/>
+          <w:numId w:val="1008"/>
         </w:numPr>
         <w:pStyle w:val="Compact"/>
       </w:pPr>
@@ -4358,7 +4412,7 @@
       <w:pPr>
         <w:numPr>
           <w:ilvl w:val="0"/>
-          <w:numId w:val="1007"/>
+          <w:numId w:val="1008"/>
         </w:numPr>
         <w:pStyle w:val="Compact"/>
       </w:pPr>
@@ -4383,7 +4437,7 @@
       <w:pPr>
         <w:numPr>
           <w:ilvl w:val="0"/>
-          <w:numId w:val="1007"/>
+          <w:numId w:val="1008"/>
         </w:numPr>
         <w:pStyle w:val="Compact"/>
       </w:pPr>
@@ -4686,40 +4740,27 @@
       <w:tr>
         <w:trPr>
           <w:tblHeader w:val="true"/>
-          <w:tblHeader w:val="true"/>
         </w:trPr>
         <w:tc>
-          <w:tcPr>
-            <w:shd w:val="clear" w:color="auto" w:fill="1E60AE"/>
-          </w:tcPr>
-          <w:p>
-            <w:pPr>
-              <w:pStyle w:val="Compact"/>
-              <w:jc w:val="left"/>
-            </w:pPr>
-            <w:r>
-              <w:rPr>
-                <w:b/>
-                <w:color w:val="FFFFFF"/>
-              </w:rPr>
+          <w:tcPr/>
+          <w:p>
+            <w:pPr>
+              <w:pStyle w:val="Compact"/>
+              <w:jc w:val="left"/>
+            </w:pPr>
+            <w:r>
               <w:t xml:space="preserve">Tab</w:t>
             </w:r>
           </w:p>
         </w:tc>
         <w:tc>
-          <w:tcPr>
-            <w:shd w:val="clear" w:color="auto" w:fill="1E60AE"/>
-          </w:tcPr>
-          <w:p>
-            <w:pPr>
-              <w:pStyle w:val="Compact"/>
-              <w:jc w:val="left"/>
-            </w:pPr>
-            <w:r>
-              <w:rPr>
-                <w:b/>
-                <w:color w:val="FFFFFF"/>
-              </w:rPr>
+          <w:tcPr/>
+          <w:p>
+            <w:pPr>
+              <w:pStyle w:val="Compact"/>
+              <w:jc w:val="left"/>
+            </w:pPr>
+            <w:r>
               <w:t xml:space="preserve">Contents</w:t>
             </w:r>
           </w:p>
@@ -5186,40 +5227,27 @@
       <w:tr>
         <w:trPr>
           <w:tblHeader w:val="true"/>
-          <w:tblHeader w:val="true"/>
         </w:trPr>
         <w:tc>
-          <w:tcPr>
-            <w:shd w:val="clear" w:color="auto" w:fill="1E60AE"/>
-          </w:tcPr>
-          <w:p>
-            <w:pPr>
-              <w:pStyle w:val="Compact"/>
-              <w:jc w:val="left"/>
-            </w:pPr>
-            <w:r>
-              <w:rPr>
-                <w:b/>
-                <w:color w:val="FFFFFF"/>
-              </w:rPr>
+          <w:tcPr/>
+          <w:p>
+            <w:pPr>
+              <w:pStyle w:val="Compact"/>
+              <w:jc w:val="left"/>
+            </w:pPr>
+            <w:r>
               <w:t xml:space="preserve">Step</w:t>
             </w:r>
           </w:p>
         </w:tc>
         <w:tc>
-          <w:tcPr>
-            <w:shd w:val="clear" w:color="auto" w:fill="1E60AE"/>
-          </w:tcPr>
-          <w:p>
-            <w:pPr>
-              <w:pStyle w:val="Compact"/>
-              <w:jc w:val="left"/>
-            </w:pPr>
-            <w:r>
-              <w:rPr>
-                <w:b/>
-                <w:color w:val="FFFFFF"/>
-              </w:rPr>
+          <w:tcPr/>
+          <w:p>
+            <w:pPr>
+              <w:pStyle w:val="Compact"/>
+              <w:jc w:val="left"/>
+            </w:pPr>
+            <w:r>
               <w:t xml:space="preserve">Who</w:t>
             </w:r>
           </w:p>
@@ -5691,7 +5719,7 @@
       <w:pPr>
         <w:numPr>
           <w:ilvl w:val="0"/>
-          <w:numId w:val="1008"/>
+          <w:numId w:val="1009"/>
         </w:numPr>
         <w:pStyle w:val="Compact"/>
       </w:pPr>
@@ -5703,7 +5731,7 @@
       <w:pPr>
         <w:numPr>
           <w:ilvl w:val="0"/>
-          <w:numId w:val="1008"/>
+          <w:numId w:val="1009"/>
         </w:numPr>
         <w:pStyle w:val="Compact"/>
       </w:pPr>
@@ -5715,7 +5743,7 @@
       <w:pPr>
         <w:numPr>
           <w:ilvl w:val="0"/>
-          <w:numId w:val="1008"/>
+          <w:numId w:val="1009"/>
         </w:numPr>
         <w:pStyle w:val="Compact"/>
       </w:pPr>
@@ -5727,7 +5755,7 @@
       <w:pPr>
         <w:numPr>
           <w:ilvl w:val="0"/>
-          <w:numId w:val="1008"/>
+          <w:numId w:val="1009"/>
         </w:numPr>
         <w:pStyle w:val="Compact"/>
       </w:pPr>
@@ -6934,40 +6962,27 @@
       <w:tr>
         <w:trPr>
           <w:tblHeader w:val="true"/>
-          <w:tblHeader w:val="true"/>
         </w:trPr>
         <w:tc>
-          <w:tcPr>
-            <w:shd w:val="clear" w:color="auto" w:fill="1E60AE"/>
-          </w:tcPr>
-          <w:p>
-            <w:pPr>
-              <w:pStyle w:val="Compact"/>
-              <w:jc w:val="left"/>
-            </w:pPr>
-            <w:r>
-              <w:rPr>
-                <w:b/>
-                <w:color w:val="FFFFFF"/>
-              </w:rPr>
+          <w:tcPr/>
+          <w:p>
+            <w:pPr>
+              <w:pStyle w:val="Compact"/>
+              <w:jc w:val="left"/>
+            </w:pPr>
+            <w:r>
               <w:t xml:space="preserve">Tab</w:t>
             </w:r>
           </w:p>
         </w:tc>
         <w:tc>
-          <w:tcPr>
-            <w:shd w:val="clear" w:color="auto" w:fill="1E60AE"/>
-          </w:tcPr>
-          <w:p>
-            <w:pPr>
-              <w:pStyle w:val="Compact"/>
-              <w:jc w:val="left"/>
-            </w:pPr>
-            <w:r>
-              <w:rPr>
-                <w:b/>
-                <w:color w:val="FFFFFF"/>
-              </w:rPr>
+          <w:tcPr/>
+          <w:p>
+            <w:pPr>
+              <w:pStyle w:val="Compact"/>
+              <w:jc w:val="left"/>
+            </w:pPr>
+            <w:r>
               <w:t xml:space="preserve">Contents</w:t>
             </w:r>
           </w:p>
@@ -7290,7 +7305,7 @@
       <w:pPr>
         <w:numPr>
           <w:ilvl w:val="0"/>
-          <w:numId w:val="1009"/>
+          <w:numId w:val="1010"/>
         </w:numPr>
       </w:pPr>
       <w:r>
@@ -7374,7 +7389,7 @@
       <w:pPr>
         <w:numPr>
           <w:ilvl w:val="0"/>
-          <w:numId w:val="1009"/>
+          <w:numId w:val="1010"/>
         </w:numPr>
       </w:pPr>
       <w:r>
@@ -7395,7 +7410,7 @@
       <w:pPr>
         <w:numPr>
           <w:ilvl w:val="1"/>
-          <w:numId w:val="1010"/>
+          <w:numId w:val="1011"/>
         </w:numPr>
         <w:pStyle w:val="Compact"/>
       </w:pPr>
@@ -7407,7 +7422,7 @@
       <w:pPr>
         <w:numPr>
           <w:ilvl w:val="1"/>
-          <w:numId w:val="1010"/>
+          <w:numId w:val="1011"/>
         </w:numPr>
         <w:pStyle w:val="Compact"/>
       </w:pPr>
@@ -7429,7 +7444,7 @@
       <w:pPr>
         <w:numPr>
           <w:ilvl w:val="1"/>
-          <w:numId w:val="1010"/>
+          <w:numId w:val="1011"/>
         </w:numPr>
         <w:pStyle w:val="Compact"/>
       </w:pPr>
@@ -7441,7 +7456,7 @@
       <w:pPr>
         <w:numPr>
           <w:ilvl w:val="1"/>
-          <w:numId w:val="1010"/>
+          <w:numId w:val="1011"/>
         </w:numPr>
         <w:pStyle w:val="Compact"/>
       </w:pPr>
@@ -7540,7 +7555,7 @@
       <w:pPr>
         <w:numPr>
           <w:ilvl w:val="0"/>
-          <w:numId w:val="1009"/>
+          <w:numId w:val="1010"/>
         </w:numPr>
       </w:pPr>
       <w:r>
@@ -7558,7 +7573,7 @@
       <w:pPr>
         <w:numPr>
           <w:ilvl w:val="0"/>
-          <w:numId w:val="1009"/>
+          <w:numId w:val="1010"/>
         </w:numPr>
       </w:pPr>
       <w:r>
@@ -7576,7 +7591,7 @@
       <w:pPr>
         <w:numPr>
           <w:ilvl w:val="0"/>
-          <w:numId w:val="1009"/>
+          <w:numId w:val="1010"/>
         </w:numPr>
       </w:pPr>
       <w:r>
@@ -7688,40 +7703,27 @@
       <w:tr>
         <w:trPr>
           <w:tblHeader w:val="true"/>
-          <w:tblHeader w:val="true"/>
         </w:trPr>
         <w:tc>
-          <w:tcPr>
-            <w:shd w:val="clear" w:color="auto" w:fill="1E60AE"/>
-          </w:tcPr>
-          <w:p>
-            <w:pPr>
-              <w:pStyle w:val="Compact"/>
-              <w:jc w:val="left"/>
-            </w:pPr>
-            <w:r>
-              <w:rPr>
-                <w:b/>
-                <w:color w:val="FFFFFF"/>
-              </w:rPr>
+          <w:tcPr/>
+          <w:p>
+            <w:pPr>
+              <w:pStyle w:val="Compact"/>
+              <w:jc w:val="left"/>
+            </w:pPr>
+            <w:r>
               <w:t xml:space="preserve">Question</w:t>
             </w:r>
           </w:p>
         </w:tc>
         <w:tc>
-          <w:tcPr>
-            <w:shd w:val="clear" w:color="auto" w:fill="1E60AE"/>
-          </w:tcPr>
-          <w:p>
-            <w:pPr>
-              <w:pStyle w:val="Compact"/>
-              <w:jc w:val="left"/>
-            </w:pPr>
-            <w:r>
-              <w:rPr>
-                <w:b/>
-                <w:color w:val="FFFFFF"/>
-              </w:rPr>
+          <w:tcPr/>
+          <w:p>
+            <w:pPr>
+              <w:pStyle w:val="Compact"/>
+              <w:jc w:val="left"/>
+            </w:pPr>
+            <w:r>
               <w:t xml:space="preserve">Answer</w:t>
             </w:r>
           </w:p>
@@ -8033,72 +8035,12 @@
       <w:pPr>
         <w:numPr>
           <w:ilvl w:val="0"/>
-          <w:numId w:val="1011"/>
+          <w:numId w:val="1012"/>
         </w:numPr>
         <w:pStyle w:val="Compact"/>
       </w:pPr>
       <w:r>
         <w:t xml:space="preserve">Task Tracker › Priorities every morning.</w:t>
-      </w:r>
-    </w:p>
-    <w:p>
-      <w:pPr>
-        <w:numPr>
-          <w:ilvl w:val="0"/>
-          <w:numId w:val="1011"/>
-        </w:numPr>
-        <w:pStyle w:val="Compact"/>
-      </w:pPr>
-      <w:r>
-        <w:t xml:space="preserve">Audit › Fieldwork: RCM, tests, sign-offs.</w:t>
-      </w:r>
-    </w:p>
-    <w:p>
-      <w:pPr>
-        <w:numPr>
-          <w:ilvl w:val="0"/>
-          <w:numId w:val="1011"/>
-        </w:numPr>
-        <w:pStyle w:val="Compact"/>
-      </w:pPr>
-      <w:r>
-        <w:t xml:space="preserve">Request evidence; review and accept it.</w:t>
-      </w:r>
-    </w:p>
-    <w:p>
-      <w:pPr>
-        <w:numPr>
-          <w:ilvl w:val="0"/>
-          <w:numId w:val="1011"/>
-        </w:numPr>
-        <w:pStyle w:val="Compact"/>
-      </w:pPr>
-      <w:r>
-        <w:t xml:space="preserve">Add issues, then publish.</w:t>
-      </w:r>
-    </w:p>
-    <w:p>
-      <w:pPr>
-        <w:numPr>
-          <w:ilvl w:val="0"/>
-          <w:numId w:val="1011"/>
-        </w:numPr>
-        <w:pStyle w:val="Compact"/>
-      </w:pPr>
-      <w:r>
-        <w:t xml:space="preserve">Validate actions in Remediation.</w:t>
-      </w:r>
-    </w:p>
-    <w:p>
-      <w:pPr>
-        <w:pStyle w:val="FirstParagraph"/>
-      </w:pPr>
-      <w:r>
-        <w:rPr>
-          <w:bCs/>
-          <w:b/>
-        </w:rPr>
-        <w:t xml:space="preserve">Manager</w:t>
       </w:r>
     </w:p>
     <w:p>
@@ -8110,7 +8052,7 @@
         <w:pStyle w:val="Compact"/>
       </w:pPr>
       <w:r>
-        <w:t xml:space="preserve">Assurance Plans: prepare, review, distribute.</w:t>
+        <w:t xml:space="preserve">Audit › Fieldwork: RCM, tests, sign-offs.</w:t>
       </w:r>
     </w:p>
     <w:p>
@@ -8122,7 +8064,7 @@
         <w:pStyle w:val="Compact"/>
       </w:pPr>
       <w:r>
-        <w:t xml:space="preserve">Start engagements and allocate teams.</w:t>
+        <w:t xml:space="preserve">Request evidence; review and accept it.</w:t>
       </w:r>
     </w:p>
     <w:p>
@@ -8134,7 +8076,7 @@
         <w:pStyle w:val="Compact"/>
       </w:pPr>
       <w:r>
-        <w:t xml:space="preserve">Review sign-offs and clear review notes.</w:t>
+        <w:t xml:space="preserve">Add issues, then publish.</w:t>
       </w:r>
     </w:p>
     <w:p>
@@ -8146,31 +8088,7 @@
         <w:pStyle w:val="Compact"/>
       </w:pPr>
       <w:r>
-        <w:t xml:space="preserve">Approve the report through the chain.</w:t>
-      </w:r>
-    </w:p>
-    <w:p>
-      <w:pPr>
-        <w:numPr>
-          <w:ilvl w:val="0"/>
-          <w:numId w:val="1012"/>
-        </w:numPr>
-        <w:pStyle w:val="Compact"/>
-      </w:pPr>
-      <w:r>
-        <w:t xml:space="preserve">Close audits (electronic signature).</w:t>
-      </w:r>
-    </w:p>
-    <w:p>
-      <w:pPr>
-        <w:numPr>
-          <w:ilvl w:val="0"/>
-          <w:numId w:val="1012"/>
-        </w:numPr>
-        <w:pStyle w:val="Compact"/>
-      </w:pPr>
-      <w:r>
-        <w:t xml:space="preserve">Committee pack each quarter.</w:t>
+        <w:t xml:space="preserve">Validate actions in Remediation.</w:t>
       </w:r>
     </w:p>
     <w:p>
@@ -8182,7 +8100,7 @@
           <w:bCs/>
           <w:b/>
         </w:rPr>
-        <w:t xml:space="preserve">Auditee</w:t>
+        <w:t xml:space="preserve">Manager</w:t>
       </w:r>
     </w:p>
     <w:p>
@@ -8194,7 +8112,7 @@
         <w:pStyle w:val="Compact"/>
       </w:pPr>
       <w:r>
-        <w:t xml:space="preserve">Task Tracker › Priorities.</w:t>
+        <w:t xml:space="preserve">Assurance Plans: prepare, review, distribute.</w:t>
       </w:r>
     </w:p>
     <w:p>
@@ -8206,7 +8124,7 @@
         <w:pStyle w:val="Compact"/>
       </w:pPr>
       <w:r>
-        <w:t xml:space="preserve">Submit the requested evidence.</w:t>
+        <w:t xml:space="preserve">Start engagements and allocate teams.</w:t>
       </w:r>
     </w:p>
     <w:p>
@@ -8218,7 +8136,7 @@
         <w:pStyle w:val="Compact"/>
       </w:pPr>
       <w:r>
-        <w:t xml:space="preserve">Respond to published issues.</w:t>
+        <w:t xml:space="preserve">Review sign-offs and clear review notes.</w:t>
       </w:r>
     </w:p>
     <w:p>
@@ -8230,7 +8148,7 @@
         <w:pStyle w:val="Compact"/>
       </w:pPr>
       <w:r>
-        <w:t xml:space="preserve">Update actions with evidence.</w:t>
+        <w:t xml:space="preserve">Approve the report through the chain.</w:t>
       </w:r>
     </w:p>
     <w:p>
@@ -8238,6 +8156,90 @@
         <w:numPr>
           <w:ilvl w:val="0"/>
           <w:numId w:val="1013"/>
+        </w:numPr>
+        <w:pStyle w:val="Compact"/>
+      </w:pPr>
+      <w:r>
+        <w:t xml:space="preserve">Close audits (electronic signature).</w:t>
+      </w:r>
+    </w:p>
+    <w:p>
+      <w:pPr>
+        <w:numPr>
+          <w:ilvl w:val="0"/>
+          <w:numId w:val="1013"/>
+        </w:numPr>
+        <w:pStyle w:val="Compact"/>
+      </w:pPr>
+      <w:r>
+        <w:t xml:space="preserve">Committee pack each quarter.</w:t>
+      </w:r>
+    </w:p>
+    <w:p>
+      <w:pPr>
+        <w:pStyle w:val="FirstParagraph"/>
+      </w:pPr>
+      <w:r>
+        <w:rPr>
+          <w:bCs/>
+          <w:b/>
+        </w:rPr>
+        <w:t xml:space="preserve">Auditee</w:t>
+      </w:r>
+    </w:p>
+    <w:p>
+      <w:pPr>
+        <w:numPr>
+          <w:ilvl w:val="0"/>
+          <w:numId w:val="1014"/>
+        </w:numPr>
+        <w:pStyle w:val="Compact"/>
+      </w:pPr>
+      <w:r>
+        <w:t xml:space="preserve">Task Tracker › Priorities.</w:t>
+      </w:r>
+    </w:p>
+    <w:p>
+      <w:pPr>
+        <w:numPr>
+          <w:ilvl w:val="0"/>
+          <w:numId w:val="1014"/>
+        </w:numPr>
+        <w:pStyle w:val="Compact"/>
+      </w:pPr>
+      <w:r>
+        <w:t xml:space="preserve">Submit the requested evidence.</w:t>
+      </w:r>
+    </w:p>
+    <w:p>
+      <w:pPr>
+        <w:numPr>
+          <w:ilvl w:val="0"/>
+          <w:numId w:val="1014"/>
+        </w:numPr>
+        <w:pStyle w:val="Compact"/>
+      </w:pPr>
+      <w:r>
+        <w:t xml:space="preserve">Respond to published issues.</w:t>
+      </w:r>
+    </w:p>
+    <w:p>
+      <w:pPr>
+        <w:numPr>
+          <w:ilvl w:val="0"/>
+          <w:numId w:val="1014"/>
+        </w:numPr>
+        <w:pStyle w:val="Compact"/>
+      </w:pPr>
+      <w:r>
+        <w:t xml:space="preserve">Update actions with evidence.</w:t>
+      </w:r>
+    </w:p>
+    <w:p>
+      <w:pPr>
+        <w:numPr>
+          <w:ilvl w:val="0"/>
+          <w:numId w:val="1014"/>
         </w:numPr>
         <w:pStyle w:val="Compact"/>
       </w:pPr>
@@ -8701,9 +8703,6 @@
     </w:lvlOverride>
   </w:num>
   <w:num w:numId="1008">
-    <w:abstractNumId w:val="991"/>
-  </w:num>
-  <w:num w:numId="1009">
     <w:abstractNumId w:val="99411"/>
     <w:lvlOverride w:ilvl="0">
       <w:startOverride w:val="1"/>
@@ -8733,10 +8732,10 @@
       <w:startOverride w:val="1"/>
     </w:lvlOverride>
   </w:num>
-  <w:num w:numId="1010">
+  <w:num w:numId="1009">
     <w:abstractNumId w:val="991"/>
   </w:num>
-  <w:num w:numId="1011">
+  <w:num w:numId="1010">
     <w:abstractNumId w:val="99411"/>
     <w:lvlOverride w:ilvl="0">
       <w:startOverride w:val="1"/>
@@ -8765,6 +8764,9 @@
     <w:lvlOverride w:ilvl="8">
       <w:startOverride w:val="1"/>
     </w:lvlOverride>
+  </w:num>
+  <w:num w:numId="1011">
+    <w:abstractNumId w:val="991"/>
   </w:num>
   <w:num w:numId="1012">
     <w:abstractNumId w:val="99411"/>
@@ -8797,6 +8799,36 @@
     </w:lvlOverride>
   </w:num>
   <w:num w:numId="1013">
+    <w:abstractNumId w:val="99411"/>
+    <w:lvlOverride w:ilvl="0">
+      <w:startOverride w:val="1"/>
+    </w:lvlOverride>
+    <w:lvlOverride w:ilvl="1">
+      <w:startOverride w:val="1"/>
+    </w:lvlOverride>
+    <w:lvlOverride w:ilvl="2">
+      <w:startOverride w:val="1"/>
+    </w:lvlOverride>
+    <w:lvlOverride w:ilvl="3">
+      <w:startOverride w:val="1"/>
+    </w:lvlOverride>
+    <w:lvlOverride w:ilvl="4">
+      <w:startOverride w:val="1"/>
+    </w:lvlOverride>
+    <w:lvlOverride w:ilvl="5">
+      <w:startOverride w:val="1"/>
+    </w:lvlOverride>
+    <w:lvlOverride w:ilvl="6">
+      <w:startOverride w:val="1"/>
+    </w:lvlOverride>
+    <w:lvlOverride w:ilvl="7">
+      <w:startOverride w:val="1"/>
+    </w:lvlOverride>
+    <w:lvlOverride w:ilvl="8">
+      <w:startOverride w:val="1"/>
+    </w:lvlOverride>
+  </w:num>
+  <w:num w:numId="1014">
     <w:abstractNumId w:val="99411"/>
     <w:lvlOverride w:ilvl="0">
       <w:startOverride w:val="1"/>

</xml_diff>